<commit_message>
docs: restore Business OS ToC and disclose AI Gateway archive condensation
- Business OS v0.7: restore the "תוכן העניינים" table of contents preserved from v0.6.
- AI Gateway v5.3: add an editorial note in the historical transition-point archive
  stating that one-time operational Fable prompt blocks and session-opener boilerplate
  were condensed (not reproduced verbatim), while every decision (D-001..D-034),
  status-history entry, risk and the full Change Log (1.0..5.3) are preserved.
- Regenerated both Hebrew RTL .docx exports from the updated canonical Markdown.

Documentation-only.

Co-Authored-By: Claude Opus 4.8 <noreply@anthropic.com>
</commit_message>
<xml_diff>
--- a/docs/releases/ArtValue_AI_Gateway_Master_Roadmap_v5.3_HE.docx
+++ b/docs/releases/ArtValue_AI_Gateway_Master_Roadmap_v5.3_HE.docx
@@ -20878,7 +20878,27 @@
           <w:szCs w:val="22"/>
           <w:rtl/>
         </w:rPr>
-        <w:t xml:space="preserve">&gt; הסעיפים הבאים נשמרים כארכיון של נקודות המעבר v4.4–v5.2 לצורך רצף היסטורי. הם אינם מקור האמת הנוכחי; המצב הפעיל מתואר ב־Current Control Panel וב־Change Log לעיל.</w:t>
+        <w:t xml:space="preserve">&gt; הסעיפים הבאים נשמרים כארכיון של נקודות המעבר v4.4–v5.3 לצורך רצף היסטורי. הם אינם מקור האמת הנוכחי; המצב הפעיל מתואר ב־Current Control Panel וב־Change Log לעיל. </w:t>
+      </w:r>
+      <w:r>
+        <w:rPr>
+          <w:rFonts w:ascii="Arial" w:hAnsi="Arial" w:cs="Arial"/>
+          <w:b/>
+          <w:bCs/>
+          <w:sz w:val="22"/>
+          <w:szCs w:val="22"/>
+          <w:rtl/>
+        </w:rPr>
+        <w:t xml:space="preserve">הערת עריכה:</w:t>
+      </w:r>
+      <w:r>
+        <w:rPr>
+          <w:rFonts w:ascii="Arial" w:hAnsi="Arial" w:cs="Arial"/>
+          <w:sz w:val="22"/>
+          <w:szCs w:val="22"/>
+          <w:rtl/>
+        </w:rPr>
+        <w:t xml:space="preserve"> תמצית התוצאה, ה־SHA והסטטוס של כל נקודת מעבר נשמרו; בלוקי ה־prompt התפעוליים החד־פעמיים לפייבל (audit/יישום/release) ופִסקאות ה־״פתיח לסשן חדש״ שהופיעו במקור v5.2 קוצרו כאן ולא שוכפלו מילה־במילה, מכיוון שהם הוראות עבודה חד־פעמיות שכבר בוצעו ונסגרו — לא החלטות, סיכונים או תוכן roadmap. כל ההחלטות (D-001…D-034), היסטוריית הסטטוס, הסיכונים ויומן השינויים המלא (1.0…5.3) שמורים לעיל.</w:t>
       </w:r>
     </w:p>
     <w:p>

</xml_diff>